<commit_message>
docs: fix final layouts and sync Vietnamese demo pack
</commit_message>
<xml_diff>
--- a/AURA/submission/AURA_BUILD_LOG_1_PAGE_2026-10-13.docx
+++ b/AURA/submission/AURA_BUILD_LOG_1_PAGE_2026-10-13.docx
@@ -5,33 +5,19 @@
     <w:p>
       <w:pPr>
         <w:pStyle w:val="Title"/>
+        <w:jc w:val="left"/>
       </w:pPr>
       <w:r>
         <w:t>AURA Build Log Sprint 2</w:t>
       </w:r>
     </w:p>
     <w:p>
-      <w:pPr>
-        <w:spacing w:after="60"/>
-      </w:pPr>
       <w:r>
         <w:rPr>
           <w:b/>
         </w:rPr>
-        <w:t>Track A The Escalation Referee | 13/10/2026 | Pham Gia Phu</w:t>
+        <w:t>Track A The Escalation Referee | Bản chốt 14/10/2026 | Phạm Gia Phú</w:t>
       </w:r>
-    </w:p>
-    <w:p>
-      <w:pPr>
-        <w:sectPr>
-          <w:headerReference w:type="default" r:id="rId9"/>
-          <w:footerReference w:type="default" r:id="rId10"/>
-          <w:pgSz w:w="12240" w:h="15840"/>
-          <w:pgMar w:top="634" w:right="691" w:bottom="605" w:left="691" w:header="346" w:footer="360" w:gutter="0"/>
-          <w:cols w:space="720"/>
-          <w:docGrid w:linePitch="360"/>
-        </w:sectPr>
-      </w:pPr>
     </w:p>
     <w:p>
       <w:r>
@@ -146,8 +132,8 @@
         </w:tblBorders>
       </w:tblPr>
       <w:tblGrid>
-        <w:gridCol w:w="5429"/>
-        <w:gridCol w:w="5429"/>
+        <w:gridCol w:w="7229"/>
+        <w:gridCol w:w="7229"/>
       </w:tblGrid>
       <w:tr>
         <w:trPr>
@@ -155,12 +141,12 @@
         </w:trPr>
         <w:tc>
           <w:tcPr>
-            <w:tcW w:type="dxa" w:w="5429"/>
+            <w:tcW w:type="dxa" w:w="7229"/>
             <w:tcMar>
-              <w:top w:w="45" w:type="dxa"/>
-              <w:start w:w="60" w:type="dxa"/>
-              <w:bottom w:w="45" w:type="dxa"/>
-              <w:end w:w="60" w:type="dxa"/>
+              <w:top w:w="75" w:type="dxa"/>
+              <w:start w:w="105" w:type="dxa"/>
+              <w:bottom w:w="75" w:type="dxa"/>
+              <w:end w:w="105" w:type="dxa"/>
             </w:tcMar>
             <w:vAlign w:val="center"/>
             <w:shd w:fill="17365D"/>
@@ -182,12 +168,12 @@
         </w:tc>
         <w:tc>
           <w:tcPr>
-            <w:tcW w:type="dxa" w:w="5429"/>
+            <w:tcW w:type="dxa" w:w="7229"/>
             <w:tcMar>
-              <w:top w:w="45" w:type="dxa"/>
-              <w:start w:w="60" w:type="dxa"/>
-              <w:bottom w:w="45" w:type="dxa"/>
-              <w:end w:w="60" w:type="dxa"/>
+              <w:top w:w="75" w:type="dxa"/>
+              <w:start w:w="105" w:type="dxa"/>
+              <w:bottom w:w="75" w:type="dxa"/>
+              <w:end w:w="105" w:type="dxa"/>
             </w:tcMar>
             <w:vAlign w:val="center"/>
             <w:shd w:fill="17365D"/>
@@ -211,12 +197,12 @@
       <w:tr>
         <w:tc>
           <w:tcPr>
-            <w:tcW w:type="dxa" w:w="5429"/>
+            <w:tcW w:type="dxa" w:w="7229"/>
             <w:tcMar>
-              <w:top w:w="45" w:type="dxa"/>
-              <w:start w:w="60" w:type="dxa"/>
-              <w:bottom w:w="45" w:type="dxa"/>
-              <w:end w:w="60" w:type="dxa"/>
+              <w:top w:w="75" w:type="dxa"/>
+              <w:start w:w="105" w:type="dxa"/>
+              <w:bottom w:w="75" w:type="dxa"/>
+              <w:end w:w="105" w:type="dxa"/>
             </w:tcMar>
             <w:vAlign w:val="center"/>
           </w:tcPr>
@@ -235,12 +221,12 @@
         </w:tc>
         <w:tc>
           <w:tcPr>
-            <w:tcW w:type="dxa" w:w="5429"/>
+            <w:tcW w:type="dxa" w:w="7229"/>
             <w:tcMar>
-              <w:top w:w="45" w:type="dxa"/>
-              <w:start w:w="60" w:type="dxa"/>
-              <w:bottom w:w="45" w:type="dxa"/>
-              <w:end w:w="60" w:type="dxa"/>
+              <w:top w:w="75" w:type="dxa"/>
+              <w:start w:w="105" w:type="dxa"/>
+              <w:bottom w:w="75" w:type="dxa"/>
+              <w:end w:w="105" w:type="dxa"/>
             </w:tcMar>
             <w:vAlign w:val="center"/>
           </w:tcPr>
@@ -261,12 +247,12 @@
       <w:tr>
         <w:tc>
           <w:tcPr>
-            <w:tcW w:type="dxa" w:w="5429"/>
+            <w:tcW w:type="dxa" w:w="7229"/>
             <w:tcMar>
-              <w:top w:w="45" w:type="dxa"/>
-              <w:start w:w="60" w:type="dxa"/>
-              <w:bottom w:w="45" w:type="dxa"/>
-              <w:end w:w="60" w:type="dxa"/>
+              <w:top w:w="75" w:type="dxa"/>
+              <w:start w:w="105" w:type="dxa"/>
+              <w:bottom w:w="75" w:type="dxa"/>
+              <w:end w:w="105" w:type="dxa"/>
             </w:tcMar>
             <w:vAlign w:val="center"/>
             <w:shd w:fill="F3F6F9"/>
@@ -286,12 +272,12 @@
         </w:tc>
         <w:tc>
           <w:tcPr>
-            <w:tcW w:type="dxa" w:w="5429"/>
+            <w:tcW w:type="dxa" w:w="7229"/>
             <w:tcMar>
-              <w:top w:w="45" w:type="dxa"/>
-              <w:start w:w="60" w:type="dxa"/>
-              <w:bottom w:w="45" w:type="dxa"/>
-              <w:end w:w="60" w:type="dxa"/>
+              <w:top w:w="75" w:type="dxa"/>
+              <w:start w:w="105" w:type="dxa"/>
+              <w:bottom w:w="75" w:type="dxa"/>
+              <w:end w:w="105" w:type="dxa"/>
             </w:tcMar>
             <w:vAlign w:val="center"/>
             <w:shd w:fill="F3F6F9"/>
@@ -313,12 +299,12 @@
       <w:tr>
         <w:tc>
           <w:tcPr>
-            <w:tcW w:type="dxa" w:w="5429"/>
+            <w:tcW w:type="dxa" w:w="7229"/>
             <w:tcMar>
-              <w:top w:w="45" w:type="dxa"/>
-              <w:start w:w="60" w:type="dxa"/>
-              <w:bottom w:w="45" w:type="dxa"/>
-              <w:end w:w="60" w:type="dxa"/>
+              <w:top w:w="75" w:type="dxa"/>
+              <w:start w:w="105" w:type="dxa"/>
+              <w:bottom w:w="75" w:type="dxa"/>
+              <w:end w:w="105" w:type="dxa"/>
             </w:tcMar>
             <w:vAlign w:val="center"/>
           </w:tcPr>
@@ -337,12 +323,12 @@
         </w:tc>
         <w:tc>
           <w:tcPr>
-            <w:tcW w:type="dxa" w:w="5429"/>
+            <w:tcW w:type="dxa" w:w="7229"/>
             <w:tcMar>
-              <w:top w:w="45" w:type="dxa"/>
-              <w:start w:w="60" w:type="dxa"/>
-              <w:bottom w:w="45" w:type="dxa"/>
-              <w:end w:w="60" w:type="dxa"/>
+              <w:top w:w="75" w:type="dxa"/>
+              <w:start w:w="105" w:type="dxa"/>
+              <w:bottom w:w="75" w:type="dxa"/>
+              <w:end w:w="105" w:type="dxa"/>
             </w:tcMar>
             <w:vAlign w:val="center"/>
           </w:tcPr>
@@ -363,12 +349,12 @@
       <w:tr>
         <w:tc>
           <w:tcPr>
-            <w:tcW w:type="dxa" w:w="5429"/>
+            <w:tcW w:type="dxa" w:w="7229"/>
             <w:tcMar>
-              <w:top w:w="45" w:type="dxa"/>
-              <w:start w:w="60" w:type="dxa"/>
-              <w:bottom w:w="45" w:type="dxa"/>
-              <w:end w:w="60" w:type="dxa"/>
+              <w:top w:w="75" w:type="dxa"/>
+              <w:start w:w="105" w:type="dxa"/>
+              <w:bottom w:w="75" w:type="dxa"/>
+              <w:end w:w="105" w:type="dxa"/>
             </w:tcMar>
             <w:vAlign w:val="center"/>
             <w:shd w:fill="F3F6F9"/>
@@ -388,12 +374,12 @@
         </w:tc>
         <w:tc>
           <w:tcPr>
-            <w:tcW w:type="dxa" w:w="5429"/>
+            <w:tcW w:type="dxa" w:w="7229"/>
             <w:tcMar>
-              <w:top w:w="45" w:type="dxa"/>
-              <w:start w:w="60" w:type="dxa"/>
-              <w:bottom w:w="45" w:type="dxa"/>
-              <w:end w:w="60" w:type="dxa"/>
+              <w:top w:w="75" w:type="dxa"/>
+              <w:start w:w="105" w:type="dxa"/>
+              <w:bottom w:w="75" w:type="dxa"/>
+              <w:end w:w="105" w:type="dxa"/>
             </w:tcMar>
             <w:vAlign w:val="center"/>
             <w:shd w:fill="F3F6F9"/>
@@ -415,12 +401,12 @@
       <w:tr>
         <w:tc>
           <w:tcPr>
-            <w:tcW w:type="dxa" w:w="5429"/>
+            <w:tcW w:type="dxa" w:w="7229"/>
             <w:tcMar>
-              <w:top w:w="45" w:type="dxa"/>
-              <w:start w:w="60" w:type="dxa"/>
-              <w:bottom w:w="45" w:type="dxa"/>
-              <w:end w:w="60" w:type="dxa"/>
+              <w:top w:w="75" w:type="dxa"/>
+              <w:start w:w="105" w:type="dxa"/>
+              <w:bottom w:w="75" w:type="dxa"/>
+              <w:end w:w="105" w:type="dxa"/>
             </w:tcMar>
             <w:vAlign w:val="center"/>
           </w:tcPr>
@@ -439,12 +425,12 @@
         </w:tc>
         <w:tc>
           <w:tcPr>
-            <w:tcW w:type="dxa" w:w="5429"/>
+            <w:tcW w:type="dxa" w:w="7229"/>
             <w:tcMar>
-              <w:top w:w="45" w:type="dxa"/>
-              <w:start w:w="60" w:type="dxa"/>
-              <w:bottom w:w="45" w:type="dxa"/>
-              <w:end w:w="60" w:type="dxa"/>
+              <w:top w:w="75" w:type="dxa"/>
+              <w:start w:w="105" w:type="dxa"/>
+              <w:bottom w:w="75" w:type="dxa"/>
+              <w:end w:w="105" w:type="dxa"/>
             </w:tcMar>
             <w:vAlign w:val="center"/>
           </w:tcPr>
@@ -495,10 +481,11 @@
       </w:r>
     </w:p>
     <w:sectPr>
-      <w:type w:val="continuous"/>
-      <w:pgSz w:w="12240" w:h="15840"/>
-      <w:pgMar w:top="634" w:right="691" w:bottom="605" w:left="691" w:header="346" w:footer="360" w:gutter="0"/>
-      <w:cols w:space="300" w:num="2"/>
+      <w:headerReference w:type="default" r:id="rId9"/>
+      <w:footerReference w:type="default" r:id="rId10"/>
+      <w:pgSz w:w="15840" w:h="12240" w:orient="landscape"/>
+      <w:pgMar w:top="605" w:right="691" w:bottom="576" w:left="691" w:header="346" w:footer="360" w:gutter="0"/>
+      <w:cols w:space="720"/>
       <w:docGrid w:linePitch="360"/>
     </w:sectPr>
   </w:body>
@@ -1262,9 +1249,6 @@
     <w:rsid w:val="00FC693F"/>
     <w:pPr>
       <w:keepNext/>
-      <w:pBdr>
-        <w:bottom w:val="single" w:sz="8" w:space="4" w:color="4F81BD" w:themeColor="accent1"/>
-      </w:pBdr>
       <w:spacing w:after="30" w:line="240" w:lineRule="auto" w:before="60"/>
       <w:contextualSpacing/>
     </w:pPr>

</xml_diff>